<commit_message>
docs(dotnet): corregir stack MAUI y servicios
</commit_message>
<xml_diff>
--- a/TI.1.2. PAO202651_SOAP_DOTNET_SINBDD_NRC36884_GR09/01. UML/02. ECUD/ECUD_SOAP_DOTNET_SINBDD_GR09.docx
+++ b/TI.1.2. PAO202651_SOAP_DOTNET_SINBDD_NRC36884_GR09/01. UML/02. ECUD/ECUD_SOAP_DOTNET_SINBDD_GR09.docx
@@ -51,7 +51,7 @@
         <w:jc w:val="center"/>
       </w:pPr>
       <w:r>
-        <w:t>(SOAP .NET - WCF / COREWCF / SINBDD)</w:t>
+        <w:t>(SOAP .NET - ASP.NET CORE 10 / SOAP 1.1 / SINBDD)</w:t>
       </w:r>
     </w:p>
     <w:p>
@@ -1659,7 +1659,7 @@
           </w:tcPr>
           <w:p>
             <w:r>
-              <w:t>El servidor WCF recibe la solicitud y extrae los parámetros usuario y clave.</w:t>
+              <w:t>El servidor ASP.NET Core recibe la solicitud y extrae los parámetros usuario y clave.</w:t>
             </w:r>
           </w:p>
         </w:tc>
@@ -2210,7 +2210,7 @@
           </w:tcPr>
           <w:p>
             <w:r>
-              <w:t>Permite al usuario autenticado convertir una medida de longitud entre las 5 unidades autorizadas del catálogo estricto: metro, centimetro, pie, yarda y milla. La solicitud se realiza mediante el contrato WCF ConvertirLongitud(token, valor, from, to) en ServicioConversion.svc.</w:t>
+              <w:t>Permite al usuario autenticado convertir una medida de longitud entre las 5 unidades autorizadas del catálogo estricto: metro, centimetro, pie, yarda y milla. La solicitud se realiza mediante el operación SOAP ConvertirLongitud(token, valor, from, to) en ServicioConversion.svc.</w:t>
             </w:r>
           </w:p>
         </w:tc>
@@ -3075,7 +3075,7 @@
           </w:tcPr>
           <w:p>
             <w:r>
-              <w:t>El servidor retorna la respuesta SOAP WCF estructurada con el valor convertido (formateado a 2 decimales), success = true y message: "Conversión exitosa."</w:t>
+              <w:t>El servidor retorna la respuesta SOAP 1.1 estructurada con el valor convertido (formateado a 2 decimales), success = true y message: "Conversión exitosa."</w:t>
             </w:r>
           </w:p>
         </w:tc>
@@ -3505,7 +3505,7 @@
           </w:tcPr>
           <w:p>
             <w:r>
-              <w:t>Permite al usuario autenticado convertir una medida de masa entre las 5 unidades autorizadas del catálogo estricto: kilogramo, gramo, libra, onza y quintal. La solicitud se realiza mediante el contrato WCF ConvertirMasa(token, valor, from, to) en ServicioConversion.svc.</w:t>
+              <w:t>Permite al usuario autenticado convertir una medida de masa entre las 5 unidades autorizadas del catálogo estricto: kilogramo, gramo, libra, onza y quintal. La solicitud se realiza mediante el operación SOAP ConvertirMasa(token, valor, from, to) en ServicioConversion.svc.</w:t>
             </w:r>
           </w:p>
         </w:tc>
@@ -4532,7 +4532,7 @@
           </w:tcPr>
           <w:p>
             <w:r>
-              <w:t>El servidor retorna la respuesta SOAP WCF estructurada con el valor convertido (formateado a 2 decimales), success = true y message: "Conversión exitosa."</w:t>
+              <w:t>El servidor retorna la respuesta SOAP 1.1 estructurada con el valor convertido (formateado a 2 decimales), success = true y message: "Conversión exitosa."</w:t>
             </w:r>
           </w:p>
         </w:tc>
@@ -4976,7 +4976,7 @@
           </w:tcPr>
           <w:p>
             <w:r>
-              <w:t>Permite al usuario autenticado convertir una medida de temperatura entre las 5 escalas autorizadas: celsius, fahrenheit, kelvin, newton y reaumur. La solicitud se realiza mediante el contrato WCF ConvertirTemperatura(token, valor, from, to) en ServicioConversion.svc.</w:t>
+              <w:t>Permite al usuario autenticado convertir una medida de temperatura entre las 5 escalas autorizadas: celsius, fahrenheit, kelvin, newton y reaumur. La solicitud se realiza mediante el operación SOAP ConvertirTemperatura(token, valor, from, to) en ServicioConversion.svc.</w:t>
             </w:r>
           </w:p>
         </w:tc>
@@ -5858,7 +5858,7 @@
           </w:tcPr>
           <w:p>
             <w:r>
-              <w:t>El servidor retorna la respuesta SOAP WCF estructurada con el valor convertido (formateado a 2 decimales), success = true y message: "Conversión exitosa."</w:t>
+              <w:t>El servidor retorna la respuesta SOAP 1.1 estructurada con el valor convertido (formateado a 2 decimales), success = true y message: "Conversión exitosa."</w:t>
             </w:r>
           </w:p>
         </w:tc>

</xml_diff>